<commit_message>
Deploiement du site web de notes de cours.
</commit_message>
<xml_diff>
--- a/projet-integrateur-1/documents/Analyse et conception - Gabarit.docx
+++ b/projet-integrateur-1/documents/Analyse et conception - Gabarit.docx
@@ -42,7 +42,7 @@
         <w:rPr>
           <w:noProof/>
         </w:rPr>
-        <w:t>19 décembre 2024</w:t>
+        <w:t>11 août 2026</w:t>
       </w:r>
       <w:r>
         <w:fldChar w:fldCharType="end"/>
@@ -176,10 +176,10 @@
           <w:r>
             <w:fldChar w:fldCharType="separate"/>
           </w:r>
-          <w:hyperlink w:anchor="_Toc176249110" w:history="1">
-            <w:r>
-              <w:rPr>
-                <w:rStyle w:val="Lienhypertexte"/>
+          <w:hyperlink w:anchor="_Toc237347876" w:history="1">
+            <w:r>
+              <w:rPr>
+                <w:rStyle w:val="Hyperlien"/>
                 <w:noProof/>
               </w:rPr>
               <w:t>1.</w:t>
@@ -198,7 +198,7 @@
             </w:r>
             <w:r>
               <w:rPr>
-                <w:rStyle w:val="Lienhypertexte"/>
+                <w:rStyle w:val="Hyperlien"/>
                 <w:noProof/>
               </w:rPr>
               <w:t>Introduction</w:t>
@@ -222,7 +222,7 @@
                 <w:noProof/>
                 <w:webHidden/>
               </w:rPr>
-              <w:instrText xml:space="preserve"> PAGEREF _Toc176249110 \h </w:instrText>
+              <w:instrText xml:space="preserve"> PAGEREF _Toc237347876 \h </w:instrText>
             </w:r>
             <w:r>
               <w:rPr>
@@ -269,10 +269,10 @@
               <w14:ligatures w14:val="standardContextual"/>
             </w:rPr>
           </w:pPr>
-          <w:hyperlink w:anchor="_Toc176249111" w:history="1">
-            <w:r>
-              <w:rPr>
-                <w:rStyle w:val="Lienhypertexte"/>
+          <w:hyperlink w:anchor="_Toc237347877" w:history="1">
+            <w:r>
+              <w:rPr>
+                <w:rStyle w:val="Hyperlien"/>
                 <w:noProof/>
               </w:rPr>
               <w:t>Protée du projet</w:t>
@@ -296,7 +296,7 @@
                 <w:noProof/>
                 <w:webHidden/>
               </w:rPr>
-              <w:instrText xml:space="preserve"> PAGEREF _Toc176249111 \h </w:instrText>
+              <w:instrText xml:space="preserve"> PAGEREF _Toc237347877 \h </w:instrText>
             </w:r>
             <w:r>
               <w:rPr>
@@ -343,10 +343,10 @@
               <w14:ligatures w14:val="standardContextual"/>
             </w:rPr>
           </w:pPr>
-          <w:hyperlink w:anchor="_Toc176249112" w:history="1">
-            <w:r>
-              <w:rPr>
-                <w:rStyle w:val="Lienhypertexte"/>
+          <w:hyperlink w:anchor="_Toc237347878" w:history="1">
+            <w:r>
+              <w:rPr>
+                <w:rStyle w:val="Hyperlien"/>
                 <w:noProof/>
               </w:rPr>
               <w:t>Définitions, Acronymes Et Abréviations</w:t>
@@ -370,7 +370,7 @@
                 <w:noProof/>
                 <w:webHidden/>
               </w:rPr>
-              <w:instrText xml:space="preserve"> PAGEREF _Toc176249112 \h </w:instrText>
+              <w:instrText xml:space="preserve"> PAGEREF _Toc237347878 \h </w:instrText>
             </w:r>
             <w:r>
               <w:rPr>
@@ -417,10 +417,10 @@
               <w14:ligatures w14:val="standardContextual"/>
             </w:rPr>
           </w:pPr>
-          <w:hyperlink w:anchor="_Toc176249113" w:history="1">
-            <w:r>
-              <w:rPr>
-                <w:rStyle w:val="Lienhypertexte"/>
+          <w:hyperlink w:anchor="_Toc237347879" w:history="1">
+            <w:r>
+              <w:rPr>
+                <w:rStyle w:val="Hyperlien"/>
                 <w:noProof/>
               </w:rPr>
               <w:t>Références</w:t>
@@ -444,7 +444,7 @@
                 <w:noProof/>
                 <w:webHidden/>
               </w:rPr>
-              <w:instrText xml:space="preserve"> PAGEREF _Toc176249113 \h </w:instrText>
+              <w:instrText xml:space="preserve"> PAGEREF _Toc237347879 \h </w:instrText>
             </w:r>
             <w:r>
               <w:rPr>
@@ -492,10 +492,10 @@
               <w14:ligatures w14:val="standardContextual"/>
             </w:rPr>
           </w:pPr>
-          <w:hyperlink w:anchor="_Toc176249114" w:history="1">
-            <w:r>
-              <w:rPr>
-                <w:rStyle w:val="Lienhypertexte"/>
+          <w:hyperlink w:anchor="_Toc237347880" w:history="1">
+            <w:r>
+              <w:rPr>
+                <w:rStyle w:val="Hyperlien"/>
                 <w:noProof/>
               </w:rPr>
               <w:t>2.</w:t>
@@ -514,7 +514,7 @@
             </w:r>
             <w:r>
               <w:rPr>
-                <w:rStyle w:val="Lienhypertexte"/>
+                <w:rStyle w:val="Hyperlien"/>
                 <w:noProof/>
               </w:rPr>
               <w:t>Présentation du produit</w:t>
@@ -538,7 +538,7 @@
                 <w:noProof/>
                 <w:webHidden/>
               </w:rPr>
-              <w:instrText xml:space="preserve"> PAGEREF _Toc176249114 \h </w:instrText>
+              <w:instrText xml:space="preserve"> PAGEREF _Toc237347880 \h </w:instrText>
             </w:r>
             <w:r>
               <w:rPr>
@@ -585,10 +585,10 @@
               <w14:ligatures w14:val="standardContextual"/>
             </w:rPr>
           </w:pPr>
-          <w:hyperlink w:anchor="_Toc176249115" w:history="1">
-            <w:r>
-              <w:rPr>
-                <w:rStyle w:val="Lienhypertexte"/>
+          <w:hyperlink w:anchor="_Toc237347881" w:history="1">
+            <w:r>
+              <w:rPr>
+                <w:rStyle w:val="Hyperlien"/>
                 <w:noProof/>
               </w:rPr>
               <w:t>Pratique et organisation du travail</w:t>
@@ -612,7 +612,7 @@
                 <w:noProof/>
                 <w:webHidden/>
               </w:rPr>
-              <w:instrText xml:space="preserve"> PAGEREF _Toc176249115 \h </w:instrText>
+              <w:instrText xml:space="preserve"> PAGEREF _Toc237347881 \h </w:instrText>
             </w:r>
             <w:r>
               <w:rPr>
@@ -659,13 +659,13 @@
               <w14:ligatures w14:val="standardContextual"/>
             </w:rPr>
           </w:pPr>
-          <w:hyperlink w:anchor="_Toc176249116" w:history="1">
-            <w:r>
-              <w:rPr>
-                <w:rStyle w:val="Lienhypertexte"/>
-                <w:noProof/>
-              </w:rPr>
-              <w:t>Solution proposée</w:t>
+          <w:hyperlink w:anchor="_Toc237347882" w:history="1">
+            <w:r>
+              <w:rPr>
+                <w:rStyle w:val="Hyperlien"/>
+                <w:noProof/>
+              </w:rPr>
+              <w:t>Entités actrices et personas</w:t>
             </w:r>
             <w:r>
               <w:rPr>
@@ -686,7 +686,81 @@
                 <w:noProof/>
                 <w:webHidden/>
               </w:rPr>
-              <w:instrText xml:space="preserve"> PAGEREF _Toc176249116 \h </w:instrText>
+              <w:instrText xml:space="preserve"> PAGEREF _Toc237347882 \h </w:instrText>
+            </w:r>
+            <w:r>
+              <w:rPr>
+                <w:noProof/>
+                <w:webHidden/>
+              </w:rPr>
+            </w:r>
+            <w:r>
+              <w:rPr>
+                <w:noProof/>
+                <w:webHidden/>
+              </w:rPr>
+              <w:fldChar w:fldCharType="separate"/>
+            </w:r>
+            <w:r>
+              <w:rPr>
+                <w:noProof/>
+                <w:webHidden/>
+              </w:rPr>
+              <w:t>4</w:t>
+            </w:r>
+            <w:r>
+              <w:rPr>
+                <w:noProof/>
+                <w:webHidden/>
+              </w:rPr>
+              <w:fldChar w:fldCharType="end"/>
+            </w:r>
+          </w:hyperlink>
+        </w:p>
+        <w:p>
+          <w:pPr>
+            <w:pStyle w:val="TM3"/>
+            <w:tabs>
+              <w:tab w:val="right" w:leader="dot" w:pos="8630"/>
+            </w:tabs>
+            <w:rPr>
+              <w:rFonts w:asciiTheme="minorHAnsi" w:hAnsiTheme="minorHAnsi"/>
+              <w:noProof/>
+              <w:kern w:val="2"/>
+              <w:sz w:val="24"/>
+              <w:szCs w:val="24"/>
+              <w:lang w:eastAsia="fr-CA"/>
+              <w14:ligatures w14:val="standardContextual"/>
+            </w:rPr>
+          </w:pPr>
+          <w:hyperlink w:anchor="_Toc237347883" w:history="1">
+            <w:r>
+              <w:rPr>
+                <w:rStyle w:val="Hyperlien"/>
+                <w:noProof/>
+              </w:rPr>
+              <w:t>Entités actrices</w:t>
+            </w:r>
+            <w:r>
+              <w:rPr>
+                <w:noProof/>
+                <w:webHidden/>
+              </w:rPr>
+              <w:tab/>
+            </w:r>
+            <w:r>
+              <w:rPr>
+                <w:noProof/>
+                <w:webHidden/>
+              </w:rPr>
+              <w:fldChar w:fldCharType="begin"/>
+            </w:r>
+            <w:r>
+              <w:rPr>
+                <w:noProof/>
+                <w:webHidden/>
+              </w:rPr>
+              <w:instrText xml:space="preserve"> PAGEREF _Toc237347883 \h </w:instrText>
             </w:r>
             <w:r>
               <w:rPr>
@@ -733,13 +807,13 @@
               <w14:ligatures w14:val="standardContextual"/>
             </w:rPr>
           </w:pPr>
-          <w:hyperlink w:anchor="_Toc176249117" w:history="1">
-            <w:r>
-              <w:rPr>
-                <w:rStyle w:val="Lienhypertexte"/>
-                <w:noProof/>
-              </w:rPr>
-              <w:t>entités actrices et personas</w:t>
+          <w:hyperlink w:anchor="_Toc237347884" w:history="1">
+            <w:r>
+              <w:rPr>
+                <w:rStyle w:val="Hyperlien"/>
+                <w:noProof/>
+              </w:rPr>
+              <w:t>Liste des cas d’utilisation</w:t>
             </w:r>
             <w:r>
               <w:rPr>
@@ -760,155 +834,7 @@
                 <w:noProof/>
                 <w:webHidden/>
               </w:rPr>
-              <w:instrText xml:space="preserve"> PAGEREF _Toc176249117 \h </w:instrText>
-            </w:r>
-            <w:r>
-              <w:rPr>
-                <w:noProof/>
-                <w:webHidden/>
-              </w:rPr>
-            </w:r>
-            <w:r>
-              <w:rPr>
-                <w:noProof/>
-                <w:webHidden/>
-              </w:rPr>
-              <w:fldChar w:fldCharType="separate"/>
-            </w:r>
-            <w:r>
-              <w:rPr>
-                <w:noProof/>
-                <w:webHidden/>
-              </w:rPr>
-              <w:t>4</w:t>
-            </w:r>
-            <w:r>
-              <w:rPr>
-                <w:noProof/>
-                <w:webHidden/>
-              </w:rPr>
-              <w:fldChar w:fldCharType="end"/>
-            </w:r>
-          </w:hyperlink>
-        </w:p>
-        <w:p>
-          <w:pPr>
-            <w:pStyle w:val="TM3"/>
-            <w:tabs>
-              <w:tab w:val="right" w:leader="dot" w:pos="8630"/>
-            </w:tabs>
-            <w:rPr>
-              <w:rFonts w:asciiTheme="minorHAnsi" w:hAnsiTheme="minorHAnsi"/>
-              <w:noProof/>
-              <w:kern w:val="2"/>
-              <w:sz w:val="24"/>
-              <w:szCs w:val="24"/>
-              <w:lang w:eastAsia="fr-CA"/>
-              <w14:ligatures w14:val="standardContextual"/>
-            </w:rPr>
-          </w:pPr>
-          <w:hyperlink w:anchor="_Toc176249118" w:history="1">
-            <w:r>
-              <w:rPr>
-                <w:rStyle w:val="Lienhypertexte"/>
-                <w:noProof/>
-              </w:rPr>
-              <w:t>Entités actrices</w:t>
-            </w:r>
-            <w:r>
-              <w:rPr>
-                <w:noProof/>
-                <w:webHidden/>
-              </w:rPr>
-              <w:tab/>
-            </w:r>
-            <w:r>
-              <w:rPr>
-                <w:noProof/>
-                <w:webHidden/>
-              </w:rPr>
-              <w:fldChar w:fldCharType="begin"/>
-            </w:r>
-            <w:r>
-              <w:rPr>
-                <w:noProof/>
-                <w:webHidden/>
-              </w:rPr>
-              <w:instrText xml:space="preserve"> PAGEREF _Toc176249118 \h </w:instrText>
-            </w:r>
-            <w:r>
-              <w:rPr>
-                <w:noProof/>
-                <w:webHidden/>
-              </w:rPr>
-            </w:r>
-            <w:r>
-              <w:rPr>
-                <w:noProof/>
-                <w:webHidden/>
-              </w:rPr>
-              <w:fldChar w:fldCharType="separate"/>
-            </w:r>
-            <w:r>
-              <w:rPr>
-                <w:noProof/>
-                <w:webHidden/>
-              </w:rPr>
-              <w:t>4</w:t>
-            </w:r>
-            <w:r>
-              <w:rPr>
-                <w:noProof/>
-                <w:webHidden/>
-              </w:rPr>
-              <w:fldChar w:fldCharType="end"/>
-            </w:r>
-          </w:hyperlink>
-        </w:p>
-        <w:p>
-          <w:pPr>
-            <w:pStyle w:val="TM2"/>
-            <w:tabs>
-              <w:tab w:val="right" w:leader="dot" w:pos="8630"/>
-            </w:tabs>
-            <w:rPr>
-              <w:rFonts w:asciiTheme="minorHAnsi" w:hAnsiTheme="minorHAnsi"/>
-              <w:noProof/>
-              <w:kern w:val="2"/>
-              <w:sz w:val="24"/>
-              <w:szCs w:val="24"/>
-              <w:lang w:eastAsia="fr-CA"/>
-              <w14:ligatures w14:val="standardContextual"/>
-            </w:rPr>
-          </w:pPr>
-          <w:hyperlink w:anchor="_Toc176249119" w:history="1">
-            <w:r>
-              <w:rPr>
-                <w:rStyle w:val="Lienhypertexte"/>
-                <w:noProof/>
-              </w:rPr>
-              <w:t>Liste des cas d’utilisation</w:t>
-            </w:r>
-            <w:r>
-              <w:rPr>
-                <w:noProof/>
-                <w:webHidden/>
-              </w:rPr>
-              <w:tab/>
-            </w:r>
-            <w:r>
-              <w:rPr>
-                <w:noProof/>
-                <w:webHidden/>
-              </w:rPr>
-              <w:fldChar w:fldCharType="begin"/>
-            </w:r>
-            <w:r>
-              <w:rPr>
-                <w:noProof/>
-                <w:webHidden/>
-              </w:rPr>
-              <w:instrText xml:space="preserve"> PAGEREF _Toc176249119 \h </w:instrText>
+              <w:instrText xml:space="preserve"> PAGEREF _Toc237347884 \h </w:instrText>
             </w:r>
             <w:r>
               <w:rPr>
@@ -956,10 +882,10 @@
               <w14:ligatures w14:val="standardContextual"/>
             </w:rPr>
           </w:pPr>
-          <w:hyperlink w:anchor="_Toc176249120" w:history="1">
-            <w:r>
-              <w:rPr>
-                <w:rStyle w:val="Lienhypertexte"/>
+          <w:hyperlink w:anchor="_Toc237347885" w:history="1">
+            <w:r>
+              <w:rPr>
+                <w:rStyle w:val="Hyperlien"/>
                 <w:noProof/>
               </w:rPr>
               <w:t>3.</w:t>
@@ -978,7 +904,7 @@
             </w:r>
             <w:r>
               <w:rPr>
-                <w:rStyle w:val="Lienhypertexte"/>
+                <w:rStyle w:val="Hyperlien"/>
                 <w:noProof/>
               </w:rPr>
               <w:t>Description des cas d’utilisation</w:t>
@@ -1002,7 +928,7 @@
                 <w:noProof/>
                 <w:webHidden/>
               </w:rPr>
-              <w:instrText xml:space="preserve"> PAGEREF _Toc176249120 \h </w:instrText>
+              <w:instrText xml:space="preserve"> PAGEREF _Toc237347885 \h </w:instrText>
             </w:r>
             <w:r>
               <w:rPr>
@@ -1049,10 +975,10 @@
               <w14:ligatures w14:val="standardContextual"/>
             </w:rPr>
           </w:pPr>
-          <w:hyperlink w:anchor="_Toc176249121" w:history="1">
-            <w:r>
-              <w:rPr>
-                <w:rStyle w:val="Lienhypertexte"/>
+          <w:hyperlink w:anchor="_Toc237347886" w:history="1">
+            <w:r>
+              <w:rPr>
+                <w:rStyle w:val="Hyperlien"/>
                 <w:noProof/>
               </w:rPr>
               <w:t>Mon cas d’utilisation 1</w:t>
@@ -1076,7 +1002,7 @@
                 <w:noProof/>
                 <w:webHidden/>
               </w:rPr>
-              <w:instrText xml:space="preserve"> PAGEREF _Toc176249121 \h </w:instrText>
+              <w:instrText xml:space="preserve"> PAGEREF _Toc237347886 \h </w:instrText>
             </w:r>
             <w:r>
               <w:rPr>
@@ -1124,10 +1050,10 @@
               <w14:ligatures w14:val="standardContextual"/>
             </w:rPr>
           </w:pPr>
-          <w:hyperlink w:anchor="_Toc176249122" w:history="1">
-            <w:r>
-              <w:rPr>
-                <w:rStyle w:val="Lienhypertexte"/>
+          <w:hyperlink w:anchor="_Toc237347887" w:history="1">
+            <w:r>
+              <w:rPr>
+                <w:rStyle w:val="Hyperlien"/>
                 <w:noProof/>
               </w:rPr>
               <w:t>4.</w:t>
@@ -1146,7 +1072,7 @@
             </w:r>
             <w:r>
               <w:rPr>
-                <w:rStyle w:val="Lienhypertexte"/>
+                <w:rStyle w:val="Hyperlien"/>
                 <w:noProof/>
               </w:rPr>
               <w:t>Conception</w:t>
@@ -1170,7 +1096,7 @@
                 <w:noProof/>
                 <w:webHidden/>
               </w:rPr>
-              <w:instrText xml:space="preserve"> PAGEREF _Toc176249122 \h </w:instrText>
+              <w:instrText xml:space="preserve"> PAGEREF _Toc237347887 \h </w:instrText>
             </w:r>
             <w:r>
               <w:rPr>
@@ -1217,10 +1143,10 @@
               <w14:ligatures w14:val="standardContextual"/>
             </w:rPr>
           </w:pPr>
-          <w:hyperlink w:anchor="_Toc176249123" w:history="1">
-            <w:r>
-              <w:rPr>
-                <w:rStyle w:val="Lienhypertexte"/>
+          <w:hyperlink w:anchor="_Toc237347888" w:history="1">
+            <w:r>
+              <w:rPr>
+                <w:rStyle w:val="Hyperlien"/>
                 <w:noProof/>
               </w:rPr>
               <w:t>Choix technologiques et matériels</w:t>
@@ -1244,7 +1170,7 @@
                 <w:noProof/>
                 <w:webHidden/>
               </w:rPr>
-              <w:instrText xml:space="preserve"> PAGEREF _Toc176249123 \h </w:instrText>
+              <w:instrText xml:space="preserve"> PAGEREF _Toc237347888 \h </w:instrText>
             </w:r>
             <w:r>
               <w:rPr>
@@ -1291,13 +1217,27 @@
               <w14:ligatures w14:val="standardContextual"/>
             </w:rPr>
           </w:pPr>
-          <w:hyperlink w:anchor="_Toc176249124" w:history="1">
-            <w:r>
-              <w:rPr>
-                <w:rStyle w:val="Lienhypertexte"/>
-                <w:noProof/>
-              </w:rPr>
-              <w:t>Programmation sécuritaire et mesures de sécurité</w:t>
+          <w:hyperlink w:anchor="_Toc237347889" w:history="1">
+            <w:r>
+              <w:rPr>
+                <w:rStyle w:val="Hyperlien"/>
+                <w:noProof/>
+              </w:rPr>
+              <w:t>Programmation sécu</w:t>
+            </w:r>
+            <w:r>
+              <w:rPr>
+                <w:rStyle w:val="Hyperlien"/>
+                <w:noProof/>
+              </w:rPr>
+              <w:t>r</w:t>
+            </w:r>
+            <w:r>
+              <w:rPr>
+                <w:rStyle w:val="Hyperlien"/>
+                <w:noProof/>
+              </w:rPr>
+              <w:t>itaire et mesures de sécurité</w:t>
             </w:r>
             <w:r>
               <w:rPr>
@@ -1318,7 +1258,7 @@
                 <w:noProof/>
                 <w:webHidden/>
               </w:rPr>
-              <w:instrText xml:space="preserve"> PAGEREF _Toc176249124 \h </w:instrText>
+              <w:instrText xml:space="preserve"> PAGEREF _Toc237347889 \h </w:instrText>
             </w:r>
             <w:r>
               <w:rPr>
@@ -1365,10 +1305,10 @@
               <w14:ligatures w14:val="standardContextual"/>
             </w:rPr>
           </w:pPr>
-          <w:hyperlink w:anchor="_Toc176249125" w:history="1">
-            <w:r>
-              <w:rPr>
-                <w:rStyle w:val="Lienhypertexte"/>
+          <w:hyperlink w:anchor="_Toc237347890" w:history="1">
+            <w:r>
+              <w:rPr>
+                <w:rStyle w:val="Hyperlien"/>
                 <w:noProof/>
               </w:rPr>
               <w:t>Mesures de sécurité</w:t>
@@ -1392,7 +1332,7 @@
                 <w:noProof/>
                 <w:webHidden/>
               </w:rPr>
-              <w:instrText xml:space="preserve"> PAGEREF _Toc176249125 \h </w:instrText>
+              <w:instrText xml:space="preserve"> PAGEREF _Toc237347890 \h </w:instrText>
             </w:r>
             <w:r>
               <w:rPr>
@@ -1439,10 +1379,10 @@
               <w14:ligatures w14:val="standardContextual"/>
             </w:rPr>
           </w:pPr>
-          <w:hyperlink w:anchor="_Toc176249126" w:history="1">
-            <w:r>
-              <w:rPr>
-                <w:rStyle w:val="Lienhypertexte"/>
+          <w:hyperlink w:anchor="_Toc237347891" w:history="1">
+            <w:r>
+              <w:rPr>
+                <w:rStyle w:val="Hyperlien"/>
                 <w:noProof/>
               </w:rPr>
               <w:t>Comportements sécuritaires recommandés</w:t>
@@ -1466,7 +1406,7 @@
                 <w:noProof/>
                 <w:webHidden/>
               </w:rPr>
-              <w:instrText xml:space="preserve"> PAGEREF _Toc176249126 \h </w:instrText>
+              <w:instrText xml:space="preserve"> PAGEREF _Toc237347891 \h </w:instrText>
             </w:r>
             <w:r>
               <w:rPr>
@@ -1513,10 +1453,10 @@
               <w14:ligatures w14:val="standardContextual"/>
             </w:rPr>
           </w:pPr>
-          <w:hyperlink w:anchor="_Toc176249127" w:history="1">
-            <w:r>
-              <w:rPr>
-                <w:rStyle w:val="Lienhypertexte"/>
+          <w:hyperlink w:anchor="_Toc237347892" w:history="1">
+            <w:r>
+              <w:rPr>
+                <w:rStyle w:val="Hyperlien"/>
                 <w:noProof/>
               </w:rPr>
               <w:t>Architecture et organisation du système</w:t>
@@ -1540,7 +1480,7 @@
                 <w:noProof/>
                 <w:webHidden/>
               </w:rPr>
-              <w:instrText xml:space="preserve"> PAGEREF _Toc176249127 \h </w:instrText>
+              <w:instrText xml:space="preserve"> PAGEREF _Toc237347892 \h </w:instrText>
             </w:r>
             <w:r>
               <w:rPr>
@@ -1587,10 +1527,10 @@
               <w14:ligatures w14:val="standardContextual"/>
             </w:rPr>
           </w:pPr>
-          <w:hyperlink w:anchor="_Toc176249128" w:history="1">
-            <w:r>
-              <w:rPr>
-                <w:rStyle w:val="Lienhypertexte"/>
+          <w:hyperlink w:anchor="_Toc237347893" w:history="1">
+            <w:r>
+              <w:rPr>
+                <w:rStyle w:val="Hyperlien"/>
                 <w:noProof/>
               </w:rPr>
               <w:t>Modélisation des données</w:t>
@@ -1614,7 +1554,7 @@
                 <w:noProof/>
                 <w:webHidden/>
               </w:rPr>
-              <w:instrText xml:space="preserve"> PAGEREF _Toc176249128 \h </w:instrText>
+              <w:instrText xml:space="preserve"> PAGEREF _Toc237347893 \h </w:instrText>
             </w:r>
             <w:r>
               <w:rPr>
@@ -1661,10 +1601,10 @@
               <w14:ligatures w14:val="standardContextual"/>
             </w:rPr>
           </w:pPr>
-          <w:hyperlink w:anchor="_Toc176249129" w:history="1">
-            <w:r>
-              <w:rPr>
-                <w:rStyle w:val="Lienhypertexte"/>
+          <w:hyperlink w:anchor="_Toc237347894" w:history="1">
+            <w:r>
+              <w:rPr>
+                <w:rStyle w:val="Hyperlien"/>
                 <w:noProof/>
               </w:rPr>
               <w:t>Modélisation du système</w:t>
@@ -1688,7 +1628,7 @@
                 <w:noProof/>
                 <w:webHidden/>
               </w:rPr>
-              <w:instrText xml:space="preserve"> PAGEREF _Toc176249129 \h </w:instrText>
+              <w:instrText xml:space="preserve"> PAGEREF _Toc237347894 \h </w:instrText>
             </w:r>
             <w:r>
               <w:rPr>
@@ -1735,10 +1675,10 @@
               <w14:ligatures w14:val="standardContextual"/>
             </w:rPr>
           </w:pPr>
-          <w:hyperlink w:anchor="_Toc176249130" w:history="1">
-            <w:r>
-              <w:rPr>
-                <w:rStyle w:val="Lienhypertexte"/>
+          <w:hyperlink w:anchor="_Toc237347895" w:history="1">
+            <w:r>
+              <w:rPr>
+                <w:rStyle w:val="Hyperlien"/>
                 <w:noProof/>
               </w:rPr>
               <w:t>Assurance qualité</w:t>
@@ -1762,7 +1702,7 @@
                 <w:noProof/>
                 <w:webHidden/>
               </w:rPr>
-              <w:instrText xml:space="preserve"> PAGEREF _Toc176249130 \h </w:instrText>
+              <w:instrText xml:space="preserve"> PAGEREF _Toc237347895 \h </w:instrText>
             </w:r>
             <w:r>
               <w:rPr>
@@ -1809,10 +1749,10 @@
               <w14:ligatures w14:val="standardContextual"/>
             </w:rPr>
           </w:pPr>
-          <w:hyperlink w:anchor="_Toc176249131" w:history="1">
-            <w:r>
-              <w:rPr>
-                <w:rStyle w:val="Lienhypertexte"/>
+          <w:hyperlink w:anchor="_Toc237347896" w:history="1">
+            <w:r>
+              <w:rPr>
+                <w:rStyle w:val="Hyperlien"/>
                 <w:noProof/>
               </w:rPr>
               <w:t>Critères d’assurance qualité</w:t>
@@ -1836,7 +1776,7 @@
                 <w:noProof/>
                 <w:webHidden/>
               </w:rPr>
-              <w:instrText xml:space="preserve"> PAGEREF _Toc176249131 \h </w:instrText>
+              <w:instrText xml:space="preserve"> PAGEREF _Toc237347896 \h </w:instrText>
             </w:r>
             <w:r>
               <w:rPr>
@@ -1883,10 +1823,10 @@
               <w14:ligatures w14:val="standardContextual"/>
             </w:rPr>
           </w:pPr>
-          <w:hyperlink w:anchor="_Toc176249132" w:history="1">
-            <w:r>
-              <w:rPr>
-                <w:rStyle w:val="Lienhypertexte"/>
+          <w:hyperlink w:anchor="_Toc237347897" w:history="1">
+            <w:r>
+              <w:rPr>
+                <w:rStyle w:val="Hyperlien"/>
                 <w:noProof/>
               </w:rPr>
               <w:t>Plan d’assurance qualité</w:t>
@@ -1910,7 +1850,7 @@
                 <w:noProof/>
                 <w:webHidden/>
               </w:rPr>
-              <w:instrText xml:space="preserve"> PAGEREF _Toc176249132 \h </w:instrText>
+              <w:instrText xml:space="preserve"> PAGEREF _Toc237347897 \h </w:instrText>
             </w:r>
             <w:r>
               <w:rPr>
@@ -1958,10 +1898,10 @@
               <w14:ligatures w14:val="standardContextual"/>
             </w:rPr>
           </w:pPr>
-          <w:hyperlink w:anchor="_Toc176249133" w:history="1">
-            <w:r>
-              <w:rPr>
-                <w:rStyle w:val="Lienhypertexte"/>
+          <w:hyperlink w:anchor="_Toc237347898" w:history="1">
+            <w:r>
+              <w:rPr>
+                <w:rStyle w:val="Hyperlien"/>
                 <w:noProof/>
               </w:rPr>
               <w:t>5.</w:t>
@@ -1980,7 +1920,7 @@
             </w:r>
             <w:r>
               <w:rPr>
-                <w:rStyle w:val="Lienhypertexte"/>
+                <w:rStyle w:val="Hyperlien"/>
                 <w:noProof/>
               </w:rPr>
               <w:t>Organisation du travail</w:t>
@@ -2004,7 +1944,7 @@
                 <w:noProof/>
                 <w:webHidden/>
               </w:rPr>
-              <w:instrText xml:space="preserve"> PAGEREF _Toc176249133 \h </w:instrText>
+              <w:instrText xml:space="preserve"> PAGEREF _Toc237347898 \h </w:instrText>
             </w:r>
             <w:r>
               <w:rPr>
@@ -2051,10 +1991,10 @@
               <w14:ligatures w14:val="standardContextual"/>
             </w:rPr>
           </w:pPr>
-          <w:hyperlink w:anchor="_Toc176249134" w:history="1">
-            <w:r>
-              <w:rPr>
-                <w:rStyle w:val="Lienhypertexte"/>
+          <w:hyperlink w:anchor="_Toc237347899" w:history="1">
+            <w:r>
+              <w:rPr>
+                <w:rStyle w:val="Hyperlien"/>
                 <w:noProof/>
               </w:rPr>
               <w:t>Outils de versionnage</w:t>
@@ -2078,7 +2018,7 @@
                 <w:noProof/>
                 <w:webHidden/>
               </w:rPr>
-              <w:instrText xml:space="preserve"> PAGEREF _Toc176249134 \h </w:instrText>
+              <w:instrText xml:space="preserve"> PAGEREF _Toc237347899 \h </w:instrText>
             </w:r>
             <w:r>
               <w:rPr>
@@ -2125,10 +2065,10 @@
               <w14:ligatures w14:val="standardContextual"/>
             </w:rPr>
           </w:pPr>
-          <w:hyperlink w:anchor="_Toc176249135" w:history="1">
-            <w:r>
-              <w:rPr>
-                <w:rStyle w:val="Lienhypertexte"/>
+          <w:hyperlink w:anchor="_Toc237347900" w:history="1">
+            <w:r>
+              <w:rPr>
+                <w:rStyle w:val="Hyperlien"/>
                 <w:noProof/>
               </w:rPr>
               <w:t>Standards de programmation et de documentation</w:t>
@@ -2152,7 +2092,7 @@
                 <w:noProof/>
                 <w:webHidden/>
               </w:rPr>
-              <w:instrText xml:space="preserve"> PAGEREF _Toc176249135 \h </w:instrText>
+              <w:instrText xml:space="preserve"> PAGEREF _Toc237347900 \h </w:instrText>
             </w:r>
             <w:r>
               <w:rPr>
@@ -2200,10 +2140,10 @@
               <w14:ligatures w14:val="standardContextual"/>
             </w:rPr>
           </w:pPr>
-          <w:hyperlink w:anchor="_Toc176249136" w:history="1">
-            <w:r>
-              <w:rPr>
-                <w:rStyle w:val="Lienhypertexte"/>
+          <w:hyperlink w:anchor="_Toc237347901" w:history="1">
+            <w:r>
+              <w:rPr>
+                <w:rStyle w:val="Hyperlien"/>
                 <w:noProof/>
               </w:rPr>
               <w:t>6.</w:t>
@@ -2222,7 +2162,7 @@
             </w:r>
             <w:r>
               <w:rPr>
-                <w:rStyle w:val="Lienhypertexte"/>
+                <w:rStyle w:val="Hyperlien"/>
                 <w:noProof/>
               </w:rPr>
               <w:t>Médiagraphie</w:t>
@@ -2246,7 +2186,7 @@
                 <w:noProof/>
                 <w:webHidden/>
               </w:rPr>
-              <w:instrText xml:space="preserve"> PAGEREF _Toc176249136 \h </w:instrText>
+              <w:instrText xml:space="preserve"> PAGEREF _Toc237347901 \h </w:instrText>
             </w:r>
             <w:r>
               <w:rPr>
@@ -2306,7 +2246,7 @@
       <w:pPr>
         <w:pStyle w:val="Titre1"/>
       </w:pPr>
-      <w:bookmarkStart w:id="0" w:name="_Toc176249110"/>
+      <w:bookmarkStart w:id="0" w:name="_Toc237347876"/>
       <w:r>
         <w:lastRenderedPageBreak/>
         <w:t>Introduction</w:t>
@@ -2321,7 +2261,7 @@
           <w:lang w:val="en-CA"/>
         </w:rPr>
       </w:pPr>
-      <w:bookmarkStart w:id="1" w:name="_Toc176249111"/>
+      <w:bookmarkStart w:id="1" w:name="_Toc237347877"/>
       <w:r>
         <w:t>Protée du projet</w:t>
       </w:r>
@@ -2491,7 +2431,7 @@
       <w:pPr>
         <w:pStyle w:val="Titre2"/>
       </w:pPr>
-      <w:bookmarkStart w:id="2" w:name="_Toc176249112"/>
+      <w:bookmarkStart w:id="2" w:name="_Toc237347878"/>
       <w:r>
         <w:t>Définitions, Acronymes Et Abréviations</w:t>
       </w:r>
@@ -2512,7 +2452,7 @@
       <w:pPr>
         <w:pStyle w:val="Titre2"/>
       </w:pPr>
-      <w:bookmarkStart w:id="3" w:name="_Toc176249113"/>
+      <w:bookmarkStart w:id="3" w:name="_Toc237347879"/>
       <w:r>
         <w:t>Références</w:t>
       </w:r>
@@ -2533,7 +2473,7 @@
       <w:pPr>
         <w:pStyle w:val="Titre1"/>
       </w:pPr>
-      <w:bookmarkStart w:id="4" w:name="_Toc176249114"/>
+      <w:bookmarkStart w:id="4" w:name="_Toc237347880"/>
       <w:r>
         <w:lastRenderedPageBreak/>
         <w:t>Présentation du produit</w:t>
@@ -2623,7 +2563,7 @@
       <w:pPr>
         <w:pStyle w:val="Titre2"/>
       </w:pPr>
-      <w:bookmarkStart w:id="5" w:name="_Toc176249115"/>
+      <w:bookmarkStart w:id="5" w:name="_Toc237347881"/>
       <w:r>
         <w:t>Pratique et organisation du travail</w:t>
       </w:r>
@@ -2644,9 +2584,20 @@
       <w:pPr>
         <w:pStyle w:val="Titre2"/>
       </w:pPr>
-      <w:bookmarkStart w:id="6" w:name="_Toc176249116"/>
-      <w:r>
-        <w:t>Solution proposée</w:t>
+    </w:p>
+    <w:p>
+      <w:pPr>
+        <w:pStyle w:val="Titre2"/>
+      </w:pPr>
+      <w:bookmarkStart w:id="6" w:name="_Toc237347882"/>
+      <w:r>
+        <w:t>E</w:t>
+      </w:r>
+      <w:r>
+        <w:t>ntités actrices</w:t>
+      </w:r>
+      <w:r>
+        <w:t xml:space="preserve"> et personas</w:t>
       </w:r>
       <w:bookmarkEnd w:id="6"/>
     </w:p>
@@ -2654,72 +2605,31 @@
       <w:pPr>
         <w:pStyle w:val="Precisions"/>
       </w:pPr>
-      <w:proofErr w:type="gramStart"/>
-      <w:r>
-        <w:t>Résume en</w:t>
-      </w:r>
-      <w:proofErr w:type="gramEnd"/>
-      <w:r>
-        <w:t xml:space="preserve"> quelques éléments </w:t>
-      </w:r>
-      <w:r>
-        <w:t xml:space="preserve">ce qui sera fait </w:t>
+      <w:r>
+        <w:t xml:space="preserve">Décrit les acteurs du système en les groupant en catégorie </w:t>
       </w:r>
       <w:r>
         <w:t>(</w:t>
       </w:r>
       <w:r>
-        <w:t>développement d’un site web, application mobile…</w:t>
+        <w:t>primaire, secondaire, partie prenante</w:t>
       </w:r>
       <w:r>
         <w:t>)</w:t>
       </w:r>
       <w:r>
-        <w:t xml:space="preserve"> et le public cible d’un tel système.</w:t>
-      </w:r>
-    </w:p>
-    <w:p>
-      <w:pPr>
-        <w:pStyle w:val="Titre2"/>
-      </w:pPr>
-      <w:bookmarkStart w:id="7" w:name="_Toc176249117"/>
-      <w:r>
-        <w:t>entités actrices</w:t>
-      </w:r>
-      <w:r>
-        <w:t xml:space="preserve"> et personas</w:t>
+        <w:t>. Les descriptions sont brèves et signifiantes. Présente les archétypes d’utilisateurs selon le gabarit donné.</w:t>
+      </w:r>
+    </w:p>
+    <w:p>
+      <w:pPr>
+        <w:pStyle w:val="Titre3"/>
+      </w:pPr>
+      <w:bookmarkStart w:id="7" w:name="_Toc237347883"/>
+      <w:r>
+        <w:t>Entités actrices</w:t>
       </w:r>
       <w:bookmarkEnd w:id="7"/>
-    </w:p>
-    <w:p>
-      <w:pPr>
-        <w:pStyle w:val="Precisions"/>
-      </w:pPr>
-      <w:r>
-        <w:t xml:space="preserve">Décrit les acteurs du système en les groupant en catégorie </w:t>
-      </w:r>
-      <w:r>
-        <w:t>(</w:t>
-      </w:r>
-      <w:r>
-        <w:t>primaire, secondaire, partie prenante</w:t>
-      </w:r>
-      <w:r>
-        <w:t>)</w:t>
-      </w:r>
-      <w:r>
-        <w:t>. Les descriptions sont brèves et signifiantes. Présente les archétypes d’utilisateurs selon le gabarit donné.</w:t>
-      </w:r>
-    </w:p>
-    <w:p>
-      <w:pPr>
-        <w:pStyle w:val="Titre3"/>
-      </w:pPr>
-      <w:bookmarkStart w:id="8" w:name="_Toc176249118"/>
-      <w:r>
-        <w:t>Entités actrices</w:t>
-      </w:r>
-      <w:bookmarkEnd w:id="8"/>
     </w:p>
     <w:tbl>
       <w:tblPr>
@@ -2867,7 +2777,7 @@
       <w:pPr>
         <w:pStyle w:val="Titre2"/>
       </w:pPr>
-      <w:bookmarkStart w:id="9" w:name="_Toc176249119"/>
+      <w:bookmarkStart w:id="8" w:name="_Toc237347884"/>
       <w:r>
         <w:t xml:space="preserve">Liste des </w:t>
       </w:r>
@@ -2877,7 +2787,7 @@
       <w:r>
         <w:t>as d’utilisation</w:t>
       </w:r>
-      <w:bookmarkEnd w:id="9"/>
+      <w:bookmarkEnd w:id="8"/>
     </w:p>
     <w:p>
       <w:pPr>
@@ -3173,7 +3083,6 @@
               <w:pStyle w:val="Precisions"/>
             </w:pPr>
             <w:r>
-              <w:lastRenderedPageBreak/>
               <w:t>#</w:t>
             </w:r>
             <w:r>
@@ -3295,29 +3204,29 @@
       <w:pPr>
         <w:pStyle w:val="Titre1"/>
       </w:pPr>
-      <w:bookmarkStart w:id="10" w:name="_Toc176249120"/>
+      <w:bookmarkStart w:id="9" w:name="_Toc237347885"/>
       <w:r>
         <w:lastRenderedPageBreak/>
         <w:t>Description des cas d’utilisation</w:t>
       </w:r>
+      <w:bookmarkEnd w:id="9"/>
+    </w:p>
+    <w:p/>
+    <w:p>
+      <w:pPr>
+        <w:pStyle w:val="Titre3"/>
+      </w:pPr>
+      <w:bookmarkStart w:id="10" w:name="_Toc237347886"/>
+      <w:r>
+        <w:t>Mon cas d’utilisation</w:t>
+      </w:r>
+      <w:r>
+        <w:t> </w:t>
+      </w:r>
+      <w:r>
+        <w:t>1</w:t>
+      </w:r>
       <w:bookmarkEnd w:id="10"/>
-    </w:p>
-    <w:p/>
-    <w:p>
-      <w:pPr>
-        <w:pStyle w:val="Titre3"/>
-      </w:pPr>
-      <w:bookmarkStart w:id="11" w:name="_Toc176249121"/>
-      <w:r>
-        <w:t>Mon cas d’utilisation</w:t>
-      </w:r>
-      <w:r>
-        <w:t> </w:t>
-      </w:r>
-      <w:r>
-        <w:t>1</w:t>
-      </w:r>
-      <w:bookmarkEnd w:id="11"/>
     </w:p>
     <w:p>
       <w:pPr>
@@ -4091,7 +4000,6 @@
         <w:tc>
           <w:tcPr>
             <w:tcW w:w="552" w:type="pct"/>
-            <w:shd w:val="clear" w:color="auto" w:fill="auto"/>
             <w:vAlign w:val="center"/>
           </w:tcPr>
           <w:p>
@@ -4106,7 +4014,6 @@
         <w:tc>
           <w:tcPr>
             <w:tcW w:w="903" w:type="pct"/>
-            <w:shd w:val="clear" w:color="auto" w:fill="auto"/>
             <w:vAlign w:val="center"/>
           </w:tcPr>
           <w:p>
@@ -4132,7 +4039,6 @@
         <w:tc>
           <w:tcPr>
             <w:tcW w:w="903" w:type="pct"/>
-            <w:shd w:val="clear" w:color="auto" w:fill="auto"/>
             <w:vAlign w:val="center"/>
           </w:tcPr>
           <w:p>
@@ -4155,7 +4061,6 @@
         <w:tc>
           <w:tcPr>
             <w:tcW w:w="1180" w:type="pct"/>
-            <w:shd w:val="clear" w:color="auto" w:fill="auto"/>
             <w:vAlign w:val="center"/>
           </w:tcPr>
           <w:p>
@@ -4170,7 +4075,6 @@
         <w:tc>
           <w:tcPr>
             <w:tcW w:w="1462" w:type="pct"/>
-            <w:shd w:val="clear" w:color="auto" w:fill="auto"/>
             <w:vAlign w:val="center"/>
           </w:tcPr>
           <w:p>
@@ -4187,7 +4091,6 @@
         <w:tc>
           <w:tcPr>
             <w:tcW w:w="552" w:type="pct"/>
-            <w:shd w:val="clear" w:color="auto" w:fill="auto"/>
             <w:vAlign w:val="center"/>
           </w:tcPr>
           <w:p>
@@ -4199,7 +4102,6 @@
         <w:tc>
           <w:tcPr>
             <w:tcW w:w="903" w:type="pct"/>
-            <w:shd w:val="clear" w:color="auto" w:fill="auto"/>
             <w:vAlign w:val="center"/>
           </w:tcPr>
           <w:p>
@@ -4211,7 +4113,6 @@
         <w:tc>
           <w:tcPr>
             <w:tcW w:w="903" w:type="pct"/>
-            <w:shd w:val="clear" w:color="auto" w:fill="auto"/>
             <w:vAlign w:val="center"/>
           </w:tcPr>
           <w:p>
@@ -4223,7 +4124,6 @@
         <w:tc>
           <w:tcPr>
             <w:tcW w:w="1180" w:type="pct"/>
-            <w:shd w:val="clear" w:color="auto" w:fill="auto"/>
             <w:vAlign w:val="center"/>
           </w:tcPr>
           <w:p>
@@ -4235,7 +4135,6 @@
         <w:tc>
           <w:tcPr>
             <w:tcW w:w="1462" w:type="pct"/>
-            <w:shd w:val="clear" w:color="auto" w:fill="auto"/>
             <w:vAlign w:val="center"/>
           </w:tcPr>
           <w:p>
@@ -4249,7 +4148,6 @@
         <w:tc>
           <w:tcPr>
             <w:tcW w:w="552" w:type="pct"/>
-            <w:shd w:val="clear" w:color="auto" w:fill="auto"/>
             <w:vAlign w:val="center"/>
           </w:tcPr>
           <w:p>
@@ -4261,7 +4159,6 @@
         <w:tc>
           <w:tcPr>
             <w:tcW w:w="903" w:type="pct"/>
-            <w:shd w:val="clear" w:color="auto" w:fill="auto"/>
             <w:vAlign w:val="center"/>
           </w:tcPr>
           <w:p>
@@ -4273,7 +4170,6 @@
         <w:tc>
           <w:tcPr>
             <w:tcW w:w="903" w:type="pct"/>
-            <w:shd w:val="clear" w:color="auto" w:fill="auto"/>
             <w:vAlign w:val="center"/>
           </w:tcPr>
           <w:p>
@@ -4285,7 +4181,6 @@
         <w:tc>
           <w:tcPr>
             <w:tcW w:w="1180" w:type="pct"/>
-            <w:shd w:val="clear" w:color="auto" w:fill="auto"/>
             <w:vAlign w:val="center"/>
           </w:tcPr>
           <w:p>
@@ -4297,7 +4192,6 @@
         <w:tc>
           <w:tcPr>
             <w:tcW w:w="1462" w:type="pct"/>
-            <w:shd w:val="clear" w:color="auto" w:fill="auto"/>
             <w:vAlign w:val="center"/>
           </w:tcPr>
           <w:p>
@@ -4318,38 +4212,52 @@
     </w:p>
     <w:p>
       <w:pPr>
-        <w:pStyle w:val="Paragraphedeliste"/>
-      </w:pPr>
-    </w:p>
-    <w:p>
-      <w:pPr>
-        <w:jc w:val="left"/>
-        <w:rPr>
-          <w:rFonts w:eastAsiaTheme="majorEastAsia" w:cstheme="majorBidi"/>
-          <w:b/>
-          <w:caps/>
-          <w:sz w:val="28"/>
-          <w:szCs w:val="36"/>
-        </w:rPr>
-      </w:pPr>
-    </w:p>
-    <w:p>
-      <w:pPr>
         <w:pStyle w:val="Titre1"/>
       </w:pPr>
-      <w:bookmarkStart w:id="12" w:name="_Toc176249122"/>
-      <w:r>
+      <w:bookmarkStart w:id="11" w:name="_Toc237347887"/>
+      <w:r>
+        <w:lastRenderedPageBreak/>
         <w:t>Conception</w:t>
       </w:r>
+      <w:bookmarkEnd w:id="11"/>
+    </w:p>
+    <w:p>
+      <w:pPr>
+        <w:pStyle w:val="Titre2"/>
+      </w:pPr>
+      <w:bookmarkStart w:id="12" w:name="_Toc237347888"/>
+      <w:r>
+        <w:t>Choix technologiques et matériels</w:t>
+      </w:r>
       <w:bookmarkEnd w:id="12"/>
     </w:p>
     <w:p>
       <w:pPr>
+        <w:pStyle w:val="Precisions"/>
+      </w:pPr>
+      <w:r>
+        <w:t>Explicite les différentes technologies qui sont utilisé</w:t>
+      </w:r>
+      <w:r>
+        <w:t>e</w:t>
+      </w:r>
+      <w:r>
+        <w:t>s pour le développement et l’opération du système.</w:t>
+      </w:r>
+      <w:r>
+        <w:t xml:space="preserve"> Chaque choix s’appuie sur des avantages qu’il apporte en lien avec les bonnes pratiques de développement ou les fonctionnalités exigées du système. Si c’est pertinent, il faut aussi présenter des technologies alternatives et les raisons qui justifient leur rejet au profit de celle utilisée.</w:t>
+      </w:r>
+      <w:r>
+        <w:t xml:space="preserve"> </w:t>
+      </w:r>
+    </w:p>
+    <w:p>
+      <w:pPr>
         <w:pStyle w:val="Titre2"/>
       </w:pPr>
-      <w:bookmarkStart w:id="13" w:name="_Toc176249123"/>
-      <w:r>
-        <w:t>Choix technologiques et matériels</w:t>
+      <w:bookmarkStart w:id="13" w:name="_Toc237347889"/>
+      <w:r>
+        <w:t>Programmation sécuritaire et mesures de sécurité</w:t>
       </w:r>
       <w:bookmarkEnd w:id="13"/>
     </w:p>
@@ -4358,48 +4266,18 @@
         <w:pStyle w:val="Precisions"/>
       </w:pPr>
       <w:r>
-        <w:t>Explicite les différentes technologies qui sont utilisé</w:t>
-      </w:r>
-      <w:r>
-        <w:t>e</w:t>
-      </w:r>
-      <w:r>
-        <w:t>s pour le développement et l’opération du système.</w:t>
-      </w:r>
-      <w:r>
-        <w:t xml:space="preserve"> Chaque choix s’appuie sur des avantages qu’il apporte en lien avec les bonnes pratiques de développement ou les fonctionnalités exigées du système. Si c’est pertinent, il faut aussi présenter des technologies alternatives et les raisons qui justifient leur rejet au profit de celle utilisée.</w:t>
-      </w:r>
-      <w:r>
-        <w:t xml:space="preserve"> </w:t>
-      </w:r>
-    </w:p>
-    <w:p>
-      <w:pPr>
-        <w:pStyle w:val="Titre2"/>
-      </w:pPr>
-      <w:bookmarkStart w:id="14" w:name="_Toc176249124"/>
-      <w:r>
-        <w:t>Programmation sécuritaire et mesures de sécurité</w:t>
+        <w:t>Présentation des actions prises dans le développement du système pour assurer la sécurité des données traitées, ainsi que des comportements exigés pour assurer la sécurité des données transmises et l’utilisation régulière du système.</w:t>
+      </w:r>
+    </w:p>
+    <w:p>
+      <w:pPr>
+        <w:pStyle w:val="Titre3"/>
+      </w:pPr>
+      <w:bookmarkStart w:id="14" w:name="_Toc237347890"/>
+      <w:r>
+        <w:t>Mesures de sécurité</w:t>
       </w:r>
       <w:bookmarkEnd w:id="14"/>
-    </w:p>
-    <w:p>
-      <w:pPr>
-        <w:pStyle w:val="Precisions"/>
-      </w:pPr>
-      <w:r>
-        <w:t>Présentation des actions prises dans le développement du système pour assurer la sécurité des données traitées, ainsi que des comportements exigés pour assurer la sécurité des données transmises et l’utilisation régulière du système.</w:t>
-      </w:r>
-    </w:p>
-    <w:p>
-      <w:pPr>
-        <w:pStyle w:val="Titre3"/>
-      </w:pPr>
-      <w:bookmarkStart w:id="15" w:name="_Toc176249125"/>
-      <w:r>
-        <w:t>Mesures de sécurité</w:t>
-      </w:r>
-      <w:bookmarkEnd w:id="15"/>
     </w:p>
     <w:tbl>
       <w:tblPr>
@@ -4622,14 +4500,14 @@
       <w:pPr>
         <w:pStyle w:val="Titre3"/>
       </w:pPr>
-      <w:bookmarkStart w:id="16" w:name="_Toc176249126"/>
+      <w:bookmarkStart w:id="15" w:name="_Toc237347891"/>
       <w:r>
         <w:t>Comportements sécuritaires</w:t>
       </w:r>
       <w:r>
         <w:t xml:space="preserve"> recommandés</w:t>
       </w:r>
-      <w:bookmarkEnd w:id="16"/>
+      <w:bookmarkEnd w:id="15"/>
     </w:p>
     <w:tbl>
       <w:tblPr>
@@ -4872,239 +4750,239 @@
       <w:pPr>
         <w:pStyle w:val="Titre2"/>
       </w:pPr>
-      <w:bookmarkStart w:id="17" w:name="_Toc176249127"/>
+      <w:bookmarkStart w:id="16" w:name="_Toc237347892"/>
       <w:r>
         <w:t>Architecture et organisation du système</w:t>
       </w:r>
+      <w:bookmarkEnd w:id="16"/>
+    </w:p>
+    <w:p>
+      <w:pPr>
+        <w:pStyle w:val="Titre3"/>
+      </w:pPr>
+      <w:bookmarkStart w:id="17" w:name="_Toc237347893"/>
+      <w:r>
+        <w:t>Modélisation des données</w:t>
+      </w:r>
       <w:bookmarkEnd w:id="17"/>
     </w:p>
     <w:p>
       <w:pPr>
+        <w:pStyle w:val="Precisions"/>
+      </w:pPr>
+      <w:r>
+        <w:t xml:space="preserve">Diagramme d’entité-relation </w:t>
+      </w:r>
+      <w:r>
+        <w:t>(</w:t>
+      </w:r>
+      <w:r>
+        <w:t>DER</w:t>
+      </w:r>
+      <w:r>
+        <w:t>)</w:t>
+      </w:r>
+      <w:r>
+        <w:t xml:space="preserve"> pour le système. Cette section présente aussi le dictionnaire des contraintes.</w:t>
+      </w:r>
+    </w:p>
+    <w:p>
+      <w:pPr>
         <w:pStyle w:val="Titre3"/>
       </w:pPr>
-      <w:bookmarkStart w:id="18" w:name="_Toc176249128"/>
-      <w:r>
-        <w:t>Modélisation des données</w:t>
+      <w:bookmarkStart w:id="18" w:name="_Toc237347894"/>
+      <w:r>
+        <w:t>Modélisation du système</w:t>
       </w:r>
       <w:bookmarkEnd w:id="18"/>
     </w:p>
+    <w:p/>
+    <w:p>
+      <w:pPr>
+        <w:pStyle w:val="Sous-titre"/>
+      </w:pPr>
+      <w:r>
+        <w:t>Diagramme de classe de conception</w:t>
+      </w:r>
+    </w:p>
     <w:p>
       <w:pPr>
         <w:pStyle w:val="Precisions"/>
       </w:pPr>
       <w:r>
-        <w:t xml:space="preserve">Diagramme d’entité-relation </w:t>
+        <w:t xml:space="preserve">Diagramme de classes de conception </w:t>
       </w:r>
       <w:r>
         <w:t>(</w:t>
       </w:r>
       <w:r>
-        <w:t>DER</w:t>
+        <w:t>DCC</w:t>
       </w:r>
       <w:r>
         <w:t>)</w:t>
       </w:r>
       <w:r>
-        <w:t xml:space="preserve"> pour le système. Cette section présente aussi le dictionnaire des contraintes.</w:t>
-      </w:r>
+        <w:t xml:space="preserve"> pour le système. </w:t>
+      </w:r>
+    </w:p>
+    <w:p>
+      <w:pPr>
+        <w:pStyle w:val="Precisions"/>
+      </w:pPr>
+    </w:p>
+    <w:p>
+      <w:pPr>
+        <w:pStyle w:val="Sous-titre"/>
+      </w:pPr>
+      <w:r>
+        <w:t>Choix des patrons architecturaux</w:t>
+      </w:r>
+    </w:p>
+    <w:p>
+      <w:pPr>
+        <w:pStyle w:val="Precisions"/>
+      </w:pPr>
+      <w:r>
+        <w:t>Explique les choix d’architectures qui ont été sélectionnés et lient leur utilisation aux caractéristiques et particularités du système.</w:t>
+      </w:r>
+    </w:p>
+    <w:p>
+      <w:pPr>
+        <w:pStyle w:val="Precisions"/>
+      </w:pPr>
+    </w:p>
+    <w:p>
+      <w:pPr>
+        <w:pStyle w:val="Titre2"/>
+      </w:pPr>
+      <w:bookmarkStart w:id="19" w:name="_Toc237347895"/>
+      <w:r>
+        <w:lastRenderedPageBreak/>
+        <w:t>Assurance qualité</w:t>
+      </w:r>
+      <w:bookmarkEnd w:id="19"/>
     </w:p>
     <w:p>
       <w:pPr>
         <w:pStyle w:val="Titre3"/>
       </w:pPr>
-      <w:bookmarkStart w:id="19" w:name="_Toc176249129"/>
-      <w:r>
-        <w:t>Modélisation du système</w:t>
-      </w:r>
-      <w:bookmarkEnd w:id="19"/>
-    </w:p>
-    <w:p/>
-    <w:p>
-      <w:pPr>
-        <w:pStyle w:val="Sous-titre"/>
-      </w:pPr>
-      <w:r>
-        <w:t>Diagramme de classe de conception</w:t>
-      </w:r>
+      <w:bookmarkStart w:id="20" w:name="_Toc237347896"/>
+      <w:r>
+        <w:t>Critères d’assurance qualité</w:t>
+      </w:r>
+      <w:bookmarkEnd w:id="20"/>
     </w:p>
     <w:p>
       <w:pPr>
         <w:pStyle w:val="Precisions"/>
       </w:pPr>
       <w:r>
-        <w:t xml:space="preserve">Diagramme de classes de conception </w:t>
-      </w:r>
-      <w:r>
-        <w:t>(</w:t>
-      </w:r>
-      <w:r>
-        <w:t>DCC</w:t>
-      </w:r>
-      <w:r>
-        <w:t>)</w:t>
-      </w:r>
-      <w:r>
-        <w:t xml:space="preserve"> pour le système. </w:t>
-      </w:r>
+        <w:t>Indique les éléments importants dans la qualité du logiciel qui sera développé. Chaque critère doit être en lien avec une des qualités d’un bon système logiciel et être contextualisé dans le système dont l’analyse est faite.</w:t>
+      </w:r>
+    </w:p>
+    <w:p>
+      <w:pPr>
+        <w:pStyle w:val="Titre3"/>
+      </w:pPr>
+      <w:bookmarkStart w:id="21" w:name="_Toc237347897"/>
+      <w:r>
+        <w:t>Plan d’assurance qualité</w:t>
+      </w:r>
+      <w:bookmarkEnd w:id="21"/>
     </w:p>
     <w:p>
       <w:pPr>
         <w:pStyle w:val="Precisions"/>
       </w:pPr>
-    </w:p>
-    <w:p>
-      <w:pPr>
-        <w:pStyle w:val="Sous-titre"/>
-      </w:pPr>
-      <w:r>
-        <w:lastRenderedPageBreak/>
-        <w:t>Choix des patrons architecturaux</w:t>
-      </w:r>
+      <w:r>
+        <w:t>Différents types de tests qui seront effectués sur le système et leur fréquence. Pour chaque type de test, la pertinence dans le contexte du système développé doit être justifiée.</w:t>
+      </w:r>
+    </w:p>
+    <w:p>
+      <w:pPr>
+        <w:pStyle w:val="Titre1"/>
+      </w:pPr>
+      <w:bookmarkStart w:id="22" w:name="_Toc237347898"/>
+      <w:r>
+        <w:t>Organisation du travail</w:t>
+      </w:r>
+      <w:bookmarkEnd w:id="22"/>
+    </w:p>
+    <w:p>
+      <w:pPr>
+        <w:pStyle w:val="Titre2"/>
+      </w:pPr>
+      <w:bookmarkStart w:id="23" w:name="_Toc237347899"/>
+      <w:r>
+        <w:t>Outil</w:t>
+      </w:r>
+      <w:r>
+        <w:t>s</w:t>
+      </w:r>
+      <w:r>
+        <w:t xml:space="preserve"> de versionnage</w:t>
+      </w:r>
+      <w:bookmarkEnd w:id="23"/>
     </w:p>
     <w:p>
       <w:pPr>
         <w:pStyle w:val="Precisions"/>
       </w:pPr>
       <w:r>
-        <w:t>Explique les choix d’architectures qui ont été sélectionnés et lient leur utilisation aux caractéristiques et particularités du système.</w:t>
+        <w:t>Type d’outil utilisé pour les différentes versions du système. Cette section décrit comme</w:t>
+      </w:r>
+      <w:r>
+        <w:t>nt</w:t>
+      </w:r>
+      <w:r>
+        <w:t xml:space="preserve"> les outils sont utilisés ainsi que les standards de nomenclature.</w:t>
+      </w:r>
+    </w:p>
+    <w:p>
+      <w:pPr>
+        <w:pStyle w:val="Titre2"/>
+      </w:pPr>
+      <w:bookmarkStart w:id="24" w:name="_Toc237347900"/>
+      <w:r>
+        <w:t>Standards de programmation</w:t>
+      </w:r>
+      <w:r>
+        <w:t xml:space="preserve"> et de documentation</w:t>
+      </w:r>
+      <w:bookmarkEnd w:id="24"/>
+      <w:r>
+        <w:tab/>
+      </w:r>
+      <w:r>
+        <w:t xml:space="preserve"> </w:t>
       </w:r>
     </w:p>
     <w:p>
       <w:pPr>
         <w:pStyle w:val="Precisions"/>
       </w:pPr>
-    </w:p>
-    <w:p>
-      <w:pPr>
-        <w:pStyle w:val="Titre2"/>
-      </w:pPr>
-      <w:bookmarkStart w:id="20" w:name="_Toc176249130"/>
-      <w:r>
-        <w:t>Assurance qualité</w:t>
-      </w:r>
-      <w:bookmarkEnd w:id="20"/>
-    </w:p>
-    <w:p>
-      <w:pPr>
-        <w:pStyle w:val="Titre3"/>
-      </w:pPr>
-      <w:bookmarkStart w:id="21" w:name="_Toc176249131"/>
-      <w:r>
-        <w:t>Critères d’assurance qualité</w:t>
-      </w:r>
-      <w:bookmarkEnd w:id="21"/>
-    </w:p>
-    <w:p>
-      <w:pPr>
-        <w:pStyle w:val="Precisions"/>
-      </w:pPr>
-      <w:r>
-        <w:t>Indique les éléments importants dans la qualité du logiciel qui sera développé. Chaque critère doit être en lien avec une des qualités d’un bon système logiciel et être contextualisé dans le système dont l’analyse est faite.</w:t>
-      </w:r>
-    </w:p>
-    <w:p>
-      <w:pPr>
-        <w:pStyle w:val="Titre3"/>
-      </w:pPr>
-      <w:bookmarkStart w:id="22" w:name="_Toc176249132"/>
-      <w:r>
-        <w:t>Plan d’assurance qualité</w:t>
-      </w:r>
-      <w:bookmarkEnd w:id="22"/>
-    </w:p>
-    <w:p>
-      <w:pPr>
-        <w:pStyle w:val="Precisions"/>
-      </w:pPr>
-      <w:r>
-        <w:t>Différents types de tests qui seront effectués sur le système et leur fréquence. Pour chaque type de test, la pertinence dans le contexte du système développé doit être justifiée.</w:t>
+      <w:r>
+        <w:t>Explicite les standards de programmation utilisés pour remettre un code uniforme dans l’équip</w:t>
+      </w:r>
+      <w:r>
+        <w:t xml:space="preserve">e. Si l’équipe utilise un standard définit par un organisme, on indique ici la référence vers ce standard. </w:t>
+      </w:r>
+      <w:r>
+        <w:t xml:space="preserve">Indique aussi quels éléments sont documentés </w:t>
+      </w:r>
+      <w:r>
+        <w:t>et le standard de documentation utilisé pour le faire.</w:t>
       </w:r>
     </w:p>
     <w:p>
       <w:pPr>
         <w:pStyle w:val="Titre1"/>
       </w:pPr>
-      <w:bookmarkStart w:id="23" w:name="_Toc176249133"/>
-      <w:r>
-        <w:t>Organisation du travail</w:t>
-      </w:r>
-      <w:bookmarkEnd w:id="23"/>
-    </w:p>
-    <w:p>
-      <w:pPr>
-        <w:pStyle w:val="Titre2"/>
-      </w:pPr>
-      <w:bookmarkStart w:id="24" w:name="_Toc176249134"/>
-      <w:r>
-        <w:t>Outil</w:t>
-      </w:r>
-      <w:r>
-        <w:t>s</w:t>
-      </w:r>
-      <w:r>
-        <w:t xml:space="preserve"> de versionnage</w:t>
-      </w:r>
-      <w:bookmarkEnd w:id="24"/>
-    </w:p>
-    <w:p>
-      <w:pPr>
-        <w:pStyle w:val="Precisions"/>
-      </w:pPr>
-      <w:r>
-        <w:t>Type d’outil utilisé pour les différentes versions du système. Cette section décrit comme</w:t>
-      </w:r>
-      <w:r>
-        <w:t>nt</w:t>
-      </w:r>
-      <w:r>
-        <w:t xml:space="preserve"> les outils sont utilisés ainsi que les standards de nomenclature.</w:t>
-      </w:r>
-    </w:p>
-    <w:p>
-      <w:pPr>
-        <w:pStyle w:val="Titre2"/>
-      </w:pPr>
-      <w:bookmarkStart w:id="25" w:name="_Toc176249135"/>
-      <w:r>
-        <w:t>Standards de programmation</w:t>
-      </w:r>
-      <w:r>
-        <w:t xml:space="preserve"> et de documentation</w:t>
+      <w:bookmarkStart w:id="25" w:name="_Toc237347901"/>
+      <w:r>
+        <w:t>Médiagraphie</w:t>
       </w:r>
       <w:bookmarkEnd w:id="25"/>
-      <w:r>
-        <w:tab/>
-      </w:r>
-      <w:r>
-        <w:t xml:space="preserve"> </w:t>
-      </w:r>
-    </w:p>
-    <w:p>
-      <w:pPr>
-        <w:pStyle w:val="Precisions"/>
-      </w:pPr>
-      <w:r>
-        <w:t>Explicite les standards de programmation utilisés pour remettre un code uniforme dans l’équip</w:t>
-      </w:r>
-      <w:r>
-        <w:t xml:space="preserve">e. Si l’équipe utilise un standard définit par un organisme, on indique ici la référence vers ce standard. </w:t>
-      </w:r>
-      <w:r>
-        <w:t xml:space="preserve">Indique aussi quels éléments sont documentés </w:t>
-      </w:r>
-      <w:r>
-        <w:t>et le standard de documentation utilisé pour le faire.</w:t>
-      </w:r>
-    </w:p>
-    <w:p>
-      <w:pPr>
-        <w:pStyle w:val="Titre1"/>
-      </w:pPr>
-      <w:bookmarkStart w:id="26" w:name="_Toc176249136"/>
-      <w:r>
-        <w:t>Médiagraphie</w:t>
-      </w:r>
-      <w:bookmarkEnd w:id="26"/>
     </w:p>
     <w:p>
       <w:pPr>
@@ -5296,25 +5174,7 @@
         <w:sz w:val="16"/>
         <w:szCs w:val="18"/>
       </w:rPr>
-      <w:t xml:space="preserve"> de Montoya J. &amp; </w:t>
-    </w:r>
-    <w:proofErr w:type="spellStart"/>
-    <w:r>
-      <w:rPr>
-        <w:color w:val="7B7B7B" w:themeColor="accent3" w:themeShade="BF"/>
-        <w:sz w:val="16"/>
-        <w:szCs w:val="18"/>
-      </w:rPr>
-      <w:t>Tangen</w:t>
-    </w:r>
-    <w:proofErr w:type="spellEnd"/>
-    <w:r>
-      <w:rPr>
-        <w:color w:val="7B7B7B" w:themeColor="accent3" w:themeShade="BF"/>
-        <w:sz w:val="16"/>
-        <w:szCs w:val="18"/>
-      </w:rPr>
-      <w:t xml:space="preserve"> A. (2019) </w:t>
+      <w:t xml:space="preserve"> de Montoya J. &amp; Tangen A. (2019) </w:t>
     </w:r>
     <w:r>
       <w:rPr>
@@ -5337,7 +5197,7 @@
     <w:hyperlink r:id="rId2" w:history="1">
       <w:r>
         <w:rPr>
-          <w:rStyle w:val="Lienhypertexte"/>
+          <w:rStyle w:val="Hyperlien"/>
           <w:color w:val="7B7B7B" w:themeColor="accent3" w:themeShade="BF"/>
           <w:sz w:val="16"/>
           <w:szCs w:val="18"/>
@@ -8193,7 +8053,7 @@
       <w:ind w:left="440"/>
     </w:pPr>
   </w:style>
-  <w:style w:type="character" w:styleId="Lienhypertexte">
+  <w:style w:type="character" w:styleId="Hyperlien">
     <w:name w:val="Hyperlink"/>
     <w:basedOn w:val="Policepardfaut"/>
     <w:uiPriority w:val="99"/>
@@ -8274,7 +8134,7 @@
       <w:shd w:val="clear" w:color="auto" w:fill="E1DFDD"/>
     </w:rPr>
   </w:style>
-  <w:style w:type="character" w:styleId="Lienhypertextesuivivisit">
+  <w:style w:type="character" w:styleId="Lienvisit">
     <w:name w:val="FollowedHyperlink"/>
     <w:basedOn w:val="Policepardfaut"/>
     <w:uiPriority w:val="99"/>

</xml_diff>